<commit_message>
docs(diplom): shorten ichki taqriz to fit one page
Condensed body from 536 to 291 words by merging the three separate
strength paragraphs into one and tightening context/criticism prose.

Co-Authored-By: Claude Opus 4.7 (1M context) <noreply@anthropic.com>
</commit_message>
<xml_diff>
--- a/diplom/DELIVERABLES/ICHKI_TAQRIZ_HAMRAYEV.docx
+++ b/diplom/DELIVERABLES/ICHKI_TAQRIZ_HAMRAYEV.docx
@@ -131,163 +131,119 @@
           <w:sz w:val="26"/>
           <w:szCs w:val="26"/>
         </w:rPr>
-        <w:t xml:space="preserve">O’zbekiston Respublikasida raqamli iqtisodiyot va sun’iy intellekt texnologiyalarini rivojlantirish davlat siyosatining ustuvor yo’nalishlaridan biri bo’lib qolmoqda. 2030-yilgacha mo’ljallangan strategiyada ilm-fan va ta’lim sohasida ilg’or axborot texnologiyalari, jumladan, tabiiy tilni qayta ishlash (Natural Language Processing) va mashina o’rganishi asosidagi yechimlarni keng joriy etish vazifasi belgilangan. Ushbu kontekstda akademik ilmiy tadqiqot natijalarini samarali umumlashtirish va xulosalash tizimlarini ishlab chiqish dolzarb ahamiyat kasb etadi.</w:t>
-      </w:r>
-    </w:p>
-    <w:p>
-      <w:pPr>
-        <w:spacing w:after="0"/>
-        <w:ind w:firstLine="708"/>
-        <w:jc w:val="both"/>
-        <w:rPr>
-          <w:rFonts w:ascii="Times New Roman" w:hAnsi="Times New Roman" w:cs="Times New Roman"/>
-          <w:b/>
-          <w:color w:val="000000"/>
-          <w:sz w:val="26"/>
-          <w:szCs w:val="26"/>
-        </w:rPr>
-      </w:pPr>
-      <w:r>
-        <w:rPr>
-          <w:rFonts w:ascii="Times New Roman" w:hAnsi="Times New Roman" w:cs="Times New Roman"/>
-          <w:b/>
-          <w:color w:val="000000"/>
-          <w:sz w:val="26"/>
-          <w:szCs w:val="26"/>
-        </w:rPr>
-        <w:t xml:space="preserve">Sun’iy intellektga asoslangan avtomatik matn xulosalash tizimlari — bu katta hajmdagi ilmiy maqolalar, hisobotlar va boshqa hujjatlarni qisqa, mazmunli va ma’nosi saqlangan shaklda taqdim etish imkonini beruvchi dasturiy vositalardir. Bunday tizimlar tadqiqotchi olimlar, magistrantlar va bakalavr talabalari uchun adabiyotlar tahlili jarayonini sezilarli darajada tezlashtiradi va ilmiy izlanishlar samaradorligini oshiradi.</w:t>
-      </w:r>
-    </w:p>
-    <w:p>
-      <w:pPr>
-        <w:spacing w:after="0"/>
-        <w:ind w:firstLine="708"/>
-        <w:jc w:val="both"/>
-        <w:rPr>
-          <w:rFonts w:ascii="Times New Roman" w:hAnsi="Times New Roman" w:cs="Times New Roman"/>
-          <w:color w:val="000000"/>
-          <w:sz w:val="26"/>
-          <w:szCs w:val="26"/>
-        </w:rPr>
-      </w:pPr>
-      <w:r>
-        <w:rPr>
-          <w:rFonts w:ascii="Times New Roman" w:hAnsi="Times New Roman" w:cs="Times New Roman"/>
-          <w:color w:val="000000"/>
-          <w:sz w:val="26"/>
-          <w:szCs w:val="26"/>
-        </w:rPr>
-        <w:t xml:space="preserve">Muallif tomonidan taqdim etilgan bitiruv malakaviy ishi ilmiy tadqiqot maqolalarini sun’iy intellekt yordamida avtomatik xulosalash dasturiy vositasini ishlab chiqishga bag’ishlangan. Ish uch bobdan iborat bo’lib, birinchi bobda tabiiy tilni qayta ishlash sohasidagi nazariy asoslar — ekstraktiv va abstraktiv xulosalash usullari, Transformer arxitekturasi, katta til modellari (LLM) va ularning akademik matnlarga qo’llanilishi batafsil yoritilgan. Ikkinchi bobda tizimning arxitekturaviy yechimi, ma’lumotlar bazasi sxemasi va foydalanuvchi interfeysi loyihalashtirilgan. Uchinchi bobda esa kompyuter qurilmalari bilan ishlashda hayot faoliyati xavfsizligi masalalari mufassal o’rganilgan.</w:t>
-      </w:r>
-    </w:p>
-    <w:p>
-      <w:pPr>
-        <w:spacing w:after="0"/>
-        <w:ind w:firstLine="708"/>
-        <w:jc w:val="both"/>
-        <w:rPr>
-          <w:rFonts w:ascii="Times New Roman" w:hAnsi="Times New Roman" w:cs="Times New Roman"/>
-          <w:color w:val="000000"/>
-          <w:sz w:val="26"/>
-          <w:szCs w:val="26"/>
-        </w:rPr>
-      </w:pPr>
-      <w:r>
-        <w:rPr>
-          <w:rFonts w:ascii="Times New Roman" w:hAnsi="Times New Roman" w:cs="Times New Roman"/>
-          <w:color w:val="000000"/>
-          <w:sz w:val="26"/>
-          <w:szCs w:val="26"/>
-        </w:rPr>
-        <w:t xml:space="preserve">Ishning nazariy qismi mukammal tayyorlangan: muallif 8 ta qiyosiy tahlil jadvali orqali turli xulosalash algoritmlari, til modellari va texnologik yechimlarning ustun va kamchilik tomonlarini ko’rsatib bergan. Foydalanilgan adabiyotlar ro’yxati 40 ta zamonaviy ilmiy manbani o’z ichiga oladi, bu esa muallifning soha bo’yicha keng nazariy tayyorgarligini tasdiqlaydi. Ish davomida tarqalgan IEEE iqtibos uslubidan to’g’ri foydalanilgan.</w:t>
-      </w:r>
-    </w:p>
-    <w:p>
-      <w:pPr>
-        <w:spacing w:after="0"/>
-        <w:ind w:firstLine="708"/>
-        <w:jc w:val="both"/>
-        <w:rPr>
-          <w:rFonts w:ascii="Times New Roman" w:hAnsi="Times New Roman" w:cs="Times New Roman"/>
-          <w:color w:val="000000"/>
-          <w:sz w:val="26"/>
-          <w:szCs w:val="26"/>
-        </w:rPr>
-      </w:pPr>
-      <w:r>
-        <w:rPr>
-          <w:rFonts w:ascii="Times New Roman" w:hAnsi="Times New Roman" w:cs="Times New Roman"/>
-          <w:color w:val="000000"/>
-          <w:sz w:val="26"/>
-          <w:szCs w:val="26"/>
-        </w:rPr>
-        <w:t xml:space="preserve">Bitiruv ishining amaliy qiymati ayniqsa yuqori. Muallif Django 5.0 freymvorki, Groq LPU infratuzilmasi va Meta Llama 3.3-70B til modeli asosida ishlovchi to’laqonli web-tizim ishlab chiqqan. Tizim hozirda summarizer.hamrayev.me manzilida real foydalanuvchilar uchun ochiq holatda ishlab turibdi. PDF hujjatlarni avtomatik qayta ishlash, hujjat bilan sun’iy intellekt asosidagi suhbat (AI chat), iqtibos eksporti (BibTeX, RIS, APA), shaxsiy ish stoli (dashboard) hamda uch tilli (o’zbek, rus, ingliz) interfeys kabi ilg’or funksionallar amalga oshirilgan.</w:t>
-      </w:r>
-    </w:p>
-    <w:p>
-      <w:pPr>
-        <w:spacing w:after="0"/>
-        <w:ind w:firstLine="708"/>
-        <w:jc w:val="both"/>
-        <w:rPr>
-          <w:rFonts w:ascii="Times New Roman" w:hAnsi="Times New Roman" w:cs="Times New Roman"/>
-          <w:color w:val="000000"/>
-          <w:sz w:val="26"/>
-          <w:szCs w:val="26"/>
-        </w:rPr>
-      </w:pPr>
-      <w:r>
-        <w:rPr>
-          <w:rFonts w:ascii="Times New Roman" w:hAnsi="Times New Roman" w:cs="Times New Roman"/>
-          <w:color w:val="000000"/>
-          <w:sz w:val="26"/>
-          <w:szCs w:val="26"/>
-        </w:rPr>
-        <w:t xml:space="preserve">Muhandislik nuqtai nazaridan ish yuqori sifatda bajarilgan. Loyiha Docker konteynerlarida paketlangan va ishlab chiqarish muhitiga muvaffaqiyatli joylashtirilgan. Tizimning arxitekturasi mantiqiy modullarga (mikroservislarga yaqin shaklda) ajratilgan, bu esa kodning saqlanishi va kengaytirilishini osonlashtiradi. Yangilik sifatida shuni alohida ta’kidlash joizki, muallif yirik hajmdagi PDF hujjatlarni qayta ishlash uchun map-reduce usuli asosidagi xulosalash algoritmini muvaffaqiyatli amalga oshirgan — bu yondashuv til modelining kontekst oynasi cheklovini chetlab o’tish imkonini beradi va dolzarb tadqiqot natijasi hisoblanadi.</w:t>
-      </w:r>
-    </w:p>
-    <w:p>
-      <w:pPr>
-        <w:spacing w:after="0"/>
-        <w:ind w:firstLine="708"/>
-        <w:jc w:val="both"/>
-        <w:rPr>
-          <w:rFonts w:ascii="Times New Roman" w:hAnsi="Times New Roman" w:cs="Times New Roman"/>
-          <w:color w:val="000000"/>
-          <w:sz w:val="26"/>
-          <w:szCs w:val="26"/>
-        </w:rPr>
-      </w:pPr>
-      <w:r>
-        <w:rPr>
-          <w:rFonts w:ascii="Times New Roman" w:hAnsi="Times New Roman" w:cs="Times New Roman"/>
-          <w:color w:val="000000"/>
-          <w:sz w:val="26"/>
-          <w:szCs w:val="26"/>
-        </w:rPr>
-        <w:t xml:space="preserve">Ishni kamchiligi sifatida shuni keltirib o’tish mumkinki, tizimning yirik akademik ma’lumotlar bazalari (Scopus, Web of Science, PubMed) bilan to’g’ridan-to’g’ri integratsiyalashuv imkoniyatlari yetarli darajada chuqur ko’rib chiqilmagan. Shuningdek, turli sohalardagi ilmiy maqolalar uchun xulosalash sifatining miqdoriy (ROUGE, BERTScore) baholash natijalari kelajakdagi tadqiqotlarda yanada kengroq taqdim etilishi maqsadga muvofiq.</w:t>
-      </w:r>
-    </w:p>
-    <w:p>
-      <w:pPr>
-        <w:spacing w:after="0"/>
-        <w:ind w:firstLine="708"/>
-        <w:jc w:val="both"/>
-        <w:rPr>
-          <w:rFonts w:ascii="Times New Roman" w:hAnsi="Times New Roman" w:cs="Times New Roman"/>
-          <w:color w:val="000000"/>
-          <w:sz w:val="26"/>
-          <w:szCs w:val="26"/>
-        </w:rPr>
-      </w:pPr>
-      <w:r>
-        <w:rPr>
-          <w:rFonts w:ascii="Times New Roman" w:hAnsi="Times New Roman" w:cs="Times New Roman"/>
-          <w:color w:val="000000"/>
-          <w:sz w:val="26"/>
-          <w:szCs w:val="26"/>
-        </w:rPr>
-        <w:t xml:space="preserve">Mazmun va mohiyati jihatidan bitiruv malakaviy ishi qo’yilgan talablarga to’liq javob beradi: sun’iy intellekt asosida ilmiy tadqiqot maqolalarini avtomatik xulosalash tizimi muvaffaqiyatli ishlab chiqilgan va amaliy foydalanishga tayyor holatga keltirilgan. Rasmiylashtirish, hujjatlashtirish va unda keltirilgan materiallar bitiruv malakaviy ishi talablariga to’liq javob beradi. Uning muallifi Hamrayev Samandar Mamanazar o’g’li “a’lo” bahoga va 60610600 — Dasturiy injiniringi yo’nalishi bo’yicha bakalavr darajasini olishga to’la loyiq deb hisoblayman.</w:t>
+        <w:t xml:space="preserve">O’zbekiston Respublikasida raqamli iqtisodiyot va sun’iy intellekt texnologiyalarini rivojlantirish davlat siyosatining ustuvor yo’nalishlaridan biri hisoblanadi. Akademik ilmiy tadqiqot natijalarini samarali umumlashtiruvchi va xulosalovchi tizimlarni ishlab chiqish bugungi kunda dolzarb ahamiyat kasb etadi.</w:t>
+      </w:r>
+    </w:p>
+    <w:p>
+      <w:pPr>
+        <w:spacing w:after="0"/>
+        <w:ind w:firstLine="708"/>
+        <w:jc w:val="both"/>
+        <w:rPr>
+          <w:rFonts w:ascii="Times New Roman" w:hAnsi="Times New Roman" w:cs="Times New Roman"/>
+          <w:b/>
+          <w:color w:val="000000"/>
+          <w:sz w:val="26"/>
+          <w:szCs w:val="26"/>
+        </w:rPr>
+      </w:pPr>
+      <w:r>
+        <w:rPr>
+          <w:rFonts w:ascii="Times New Roman" w:hAnsi="Times New Roman" w:cs="Times New Roman"/>
+          <w:b/>
+          <w:color w:val="000000"/>
+          <w:sz w:val="26"/>
+          <w:szCs w:val="26"/>
+        </w:rPr>
+        <w:t xml:space="preserve">Sun’iy intellektga asoslangan avtomatik xulosalash tizimlari katta hajmdagi ilmiy maqolalarni qisqa va mazmunli shaklda taqdim etib, tadqiqotchilar uchun adabiyotlar tahlili jarayonini sezilarli darajada tezlashtiradi.</w:t>
+      </w:r>
+    </w:p>
+    <w:p>
+      <w:pPr>
+        <w:spacing w:after="0"/>
+        <w:ind w:firstLine="708"/>
+        <w:jc w:val="both"/>
+        <w:rPr>
+          <w:rFonts w:ascii="Times New Roman" w:hAnsi="Times New Roman" w:cs="Times New Roman"/>
+          <w:color w:val="000000"/>
+          <w:sz w:val="26"/>
+          <w:szCs w:val="26"/>
+        </w:rPr>
+      </w:pPr>
+      <w:r>
+        <w:rPr>
+          <w:rFonts w:ascii="Times New Roman" w:hAnsi="Times New Roman" w:cs="Times New Roman"/>
+          <w:color w:val="000000"/>
+          <w:sz w:val="26"/>
+          <w:szCs w:val="26"/>
+        </w:rPr>
+        <w:t xml:space="preserve">Muallif tomonidan taqdim etilgan bitiruv malakaviy ishi mazkur sohaga bag’ishlangan bo’lib, uch bobdan iborat: birinchi bobda tabiiy tilni qayta ishlash, Transformer arxitekturasi va katta til modellari (LLM)ning nazariy asoslari; ikkinchi bobda tizimning arxitekturaviy yechimi va foydalanuvchi interfeysi; uchinchi bobda hayot faoliyati xavfsizligi masalalari yoritilgan.</w:t>
+      </w:r>
+    </w:p>
+    <w:p>
+      <w:pPr>
+        <w:spacing w:after="0"/>
+        <w:ind w:firstLine="708"/>
+        <w:jc w:val="both"/>
+        <w:rPr>
+          <w:rFonts w:ascii="Times New Roman" w:hAnsi="Times New Roman" w:cs="Times New Roman"/>
+          <w:color w:val="000000"/>
+          <w:sz w:val="26"/>
+          <w:szCs w:val="26"/>
+        </w:rPr>
+      </w:pPr>
+      <w:r>
+        <w:rPr>
+          <w:rFonts w:ascii="Times New Roman" w:hAnsi="Times New Roman" w:cs="Times New Roman"/>
+          <w:color w:val="000000"/>
+          <w:sz w:val="26"/>
+          <w:szCs w:val="26"/>
+        </w:rPr>
+        <w:t xml:space="preserve">Ishning nazariy qismi puxta tayyorlangan: 8 ta qiyosiy tahlil jadvali va 40 ta zamonaviy ilmiy manbadan iborat adabiyotlar ro’yxati muallifning soha bo’yicha keng tayyorgarligini tasdiqlaydi. Amaliy qiymati ayniqsa yuqori — Django 5.0, Groq LPU infratuzilmasi va Meta Llama 3.3-70B til modeli asosida to’laqonli web-tizim ishlab chiqilgan va summarizer.hamrayev.me manzilida real foydalanuvchilar uchun ochiq holatda ishlab turibdi. PDF qayta ishlash, AI chat, iqtibos eksporti hamda uch tilli (o’zbek, rus, ingliz) interfeys amalga oshirilgan. Loyiha Docker konteynerlarida paketlangan; yirik PDF hujjatlar uchun map-reduce usuli asosidagi xulosalash algoritmi muvaffaqiyatli qo’llanilgan, bu esa dolzarb muhandislik yechimi hisoblanadi.</w:t>
+      </w:r>
+    </w:p>
+    <w:p>
+      <w:pPr>
+        <w:spacing w:after="0"/>
+        <w:ind w:firstLine="708"/>
+        <w:jc w:val="both"/>
+        <w:rPr>
+          <w:rFonts w:ascii="Times New Roman" w:hAnsi="Times New Roman" w:cs="Times New Roman"/>
+          <w:color w:val="000000"/>
+          <w:sz w:val="26"/>
+          <w:szCs w:val="26"/>
+        </w:rPr>
+      </w:pPr>
+      <w:r>
+        <w:rPr>
+          <w:rFonts w:ascii="Times New Roman" w:hAnsi="Times New Roman" w:cs="Times New Roman"/>
+          <w:color w:val="000000"/>
+          <w:sz w:val="26"/>
+          <w:szCs w:val="26"/>
+        </w:rPr>
+        <w:t xml:space="preserve">Ishni kamchiligi sifatida shuni keltirib o’tish mumkinki, xulosalash sifatining miqdoriy (ROUGE, BERTScore) baholash natijalari yanada kengroq taqdim etilishi maqsadga muvofiq edi.</w:t>
+      </w:r>
+    </w:p>
+    <w:p>
+      <w:pPr>
+        <w:spacing w:after="0"/>
+        <w:ind w:firstLine="708"/>
+        <w:jc w:val="both"/>
+        <w:rPr>
+          <w:rFonts w:ascii="Times New Roman" w:hAnsi="Times New Roman" w:cs="Times New Roman"/>
+          <w:color w:val="000000"/>
+          <w:sz w:val="26"/>
+          <w:szCs w:val="26"/>
+        </w:rPr>
+      </w:pPr>
+      <w:r>
+        <w:rPr>
+          <w:rFonts w:ascii="Times New Roman" w:hAnsi="Times New Roman" w:cs="Times New Roman"/>
+          <w:color w:val="000000"/>
+          <w:sz w:val="26"/>
+          <w:szCs w:val="26"/>
+        </w:rPr>
+        <w:t xml:space="preserve">Mazmun va mohiyati jihatidan bitiruv malakaviy ishi qo’yilgan talablarga to’liq javob beradi. Uning muallifi Hamrayev Samandar Mamanazar o’g’li “a’lo” bahoga va 60610600 — Dasturiy injiniringi yo’nalishi bo’yicha bakalavr darajasini olishga to’la loyiq deb hisoblayman.</w:t>
       </w:r>
     </w:p>
     <w:p>

</xml_diff>

<commit_message>
docs(diplom): rename "bitiruv malakaviy ishi" to "diplom loyihasi"
Aligns terminology with the official document type used in the
university's registration record. Replaces every case-inflected form
("ishi/ishining/ishida/ishiga/ishini") with the matching "loyihasi"
form so suffix grammar still reads naturally, and converts the BMI
acronym to DL.

(Only the ichki taqriz is tracked; the other v2/antiplagiat/HFX/pptx
files are gitignored but were edited in the working tree in the same
pass.)

Co-Authored-By: Claude Opus 4.7 (1M context) <noreply@anthropic.com>
</commit_message>
<xml_diff>
--- a/diplom/DELIVERABLES/ICHKI_TAQRIZ_HAMRAYEV.docx
+++ b/diplom/DELIVERABLES/ICHKI_TAQRIZ_HAMRAYEV.docx
@@ -77,7 +77,7 @@
           <w:sz w:val="26"/>
           <w:szCs w:val="26"/>
         </w:rPr>
-        <w:t>60610600 — Dasturiy injiniringi yo’nalishi bo’yicha taqdim etilgan Hamrayev Samandar Mamanazar o’g’lining “Akademik ilmiy maqolalar uchun sun’iy intellekt asosidagi hujjatlarni umumlashtirish vositasini ishlab chiqish” mavzusiga bag’ishlangan bitiruv malakaviy ishiga</w:t>
+        <w:t>60610600 — Dasturiy injiniringi yo’nalishi bo’yicha taqdim etilgan Hamrayev Samandar Mamanazar o’g’lining “Akademik ilmiy maqolalar uchun sun’iy intellekt asosidagi hujjatlarni umumlashtirish vositasini ishlab chiqish” mavzusiga bag’ishlangan diplom loyihasiga</w:t>
       </w:r>
     </w:p>
     <w:p>
@@ -91,6 +91,8 @@
           <w:szCs w:val="26"/>
         </w:rPr>
       </w:pPr>
+      <w:bookmarkStart w:id="0" w:name="_GoBack"/>
+      <w:bookmarkEnd w:id="0"/>
       <w:r>
         <w:rPr>
           <w:rFonts w:ascii="Times New Roman" w:hAnsi="Times New Roman" w:cs="Times New Roman"/>
@@ -121,7 +123,7 @@
           <w:sz w:val="26"/>
           <w:szCs w:val="26"/>
         </w:rPr>
-        <w:t>Ushbu bitiruv malakaviy ishi sun’iy intellekt asosida akademik ilmiy maqolalarni avtomatik umumlashtirish tizimini ishlab chiqishga bag’ishlangan. O’zbekiston Respublikasida raqamli iqtisodiyot va sun’iy intellekt texnologiyalarini rivojlantirish davlat siyosatining ustuvor yo’nalishlaridan biri hisoblanadi. Akademik ilmiy tadqiqot natijalarini samarali umumlashtiruvchi dasturiy tizimlarni ishlab chiqish bugungi kunda dolzarb vazifalardan biriga aylanmoqda.</w:t>
+        <w:t>Ushbu diplom loyihasi sun’iy intellekt asosida akademik ilmiy maqolalarni avtomatik umumlashtirish tizimini ishlab chiqishga bag’ishlangan. O’zbekiston Respublikasida raqamli iqtisodiyot va sun’iy intellekt texnologiyalarini rivojlantirish davlat siyosatining ustuvor yo’nalishlaridan biri hisoblanadi. Akademik ilmiy tadqiqot natijalarini samarali umumlashtiruvchi dasturiy tizimlarni ishlab chiqish bugungi kunda dolzarb vazifalardan biriga aylanmoqda.</w:t>
       </w:r>
     </w:p>
     <w:p>
@@ -143,7 +145,7 @@
           <w:sz w:val="26"/>
           <w:szCs w:val="26"/>
         </w:rPr>
-        <w:t>Bitiruv malakaviy ishi uch bobdan iborat: birinchi bobda tabiiy tilni qayta ishlash hamda katta til modellari (LLM) nazariy asoslari, ikkinchi bobda tizim arxitekturasi va foydalanuvchi interfeysi, uchinchi bobda hayot faoliyati xavfsizligi masalalari yoritilgan.</w:t>
+        <w:t>Diplom loyihasi uch bobdan iborat: birinchi bobda tabiiy tilni qayta ishlash hamda katta til modellari (LLM) nazariy asoslari, ikkinchi bobda tizim arxitekturasi va foydalanuvchi interfeysi, uchinchi bobda hayot faoliyati xavfsizligi masalalari yoritilgan.</w:t>
       </w:r>
     </w:p>
     <w:p>
@@ -189,25 +191,6 @@
         </w:rPr>
         <w:t>Ishning kamchiligi sifatida shuni keltirib o’tish mumkinki, umumlashtirish sifatining miqdoriy baholash natijalari (ROUGE, BERTScore) yanada kengroq taqdim etilishi mumkin edi.</w:t>
       </w:r>
-      <w:r>
-        <w:rPr>
-          <w:rFonts w:hint="default"/>
-          <w:color w:val="000000"/>
-          <w:sz w:val="26"/>
-          <w:szCs w:val="26"/>
-          <w:lang w:val="en-US"/>
-        </w:rPr>
-        <w:t xml:space="preserve"/>
-      </w:r>
-      <w:r>
-        <w:rPr>
-          <w:rFonts w:hint="default" w:ascii="Times New Roman" w:hAnsi="Times New Roman"/>
-          <w:color w:val="000000"/>
-          <w:sz w:val="26"/>
-          <w:szCs w:val="26"/>
-        </w:rPr>
-        <w:t/>
-      </w:r>
     </w:p>
     <w:p>
       <w:pPr>
@@ -227,7 +210,7 @@
           <w:sz w:val="26"/>
           <w:szCs w:val="26"/>
         </w:rPr>
-        <w:t>Mazmun va mohiyati jihatidan bitiruv malakaviy ishi qo’yilgan talablarga to’liq javob beradi. Uning muallifi Hamrayev Samandar Mamanazar o’g’li “a’lo” bahoga hamda 60610600 — Dasturiy injiniringi yo’nalishi bo’yicha bakalavr darajasini olishga to’liq loyiq deb hisoblayman.</w:t>
+        <w:t>Mazmun va mohiyati jihatidan diplom loyihasi qo’yilgan talablarga to’liq javob beradi. Uning muallifi Hamrayev Samandar Mamanazar o’g’li “a’lo” bahoga hamda 60610600 — Dasturiy injiniringi yo’nalishi bo’yicha bakalavr darajasini olishga to’liq loyiq deb hisoblayman.</w:t>
       </w:r>
     </w:p>
     <w:p>
@@ -296,8 +279,6 @@
         </w:rPr>
         <w:t>xtajon</w:t>
       </w:r>
-      <w:bookmarkStart w:id="0" w:name="_GoBack"/>
-      <w:bookmarkEnd w:id="0"/>
     </w:p>
     <w:p>
       <w:pPr>
@@ -420,7 +401,6 @@
           <w:szCs w:val="26"/>
         </w:rPr>
         <w:tab/>
-        <w:t/>
       </w:r>
       <w:r>
         <w:rPr>
@@ -432,7 +412,6 @@
           <w:szCs w:val="26"/>
         </w:rPr>
         <w:tab/>
-        <w:t/>
       </w:r>
       <w:r>
         <w:rPr>
@@ -444,6 +423,16 @@
           <w:szCs w:val="26"/>
         </w:rPr>
         <w:tab/>
+      </w:r>
+      <w:r>
+        <w:rPr>
+          <w:rFonts w:ascii="Times New Roman" w:hAnsi="Times New Roman" w:cs="Times New Roman"/>
+          <w:b w:val="0"/>
+          <w:bCs/>
+          <w:color w:val="000000"/>
+          <w:sz w:val="26"/>
+          <w:szCs w:val="26"/>
+        </w:rPr>
         <w:t>Sana: “____” ____________ 2026-yil</w:t>
       </w:r>
     </w:p>
@@ -775,7 +764,7 @@
       <w:spacing w:after="0" w:line="276" w:lineRule="auto"/>
     </w:pPr>
     <w:rPr>
-      <w:rFonts w:ascii="Times New Roman" w:hAnsi="Times New Roman" w:cs="Times New Roman"/>
+      <w:rFonts w:ascii="Times New Roman" w:hAnsi="Times New Roman" w:eastAsia="SimSun" w:cs="Times New Roman"/>
       <w:sz w:val="26"/>
       <w:szCs w:val="26"/>
       <w:lang w:val="en-US" w:eastAsia="en-US" w:bidi="ar-SA"/>

</xml_diff>

<commit_message>
docs(diplom): fit all three review docs onto one A4 page each
Rebuilt ICHKI, TASHQI, and RAHBAR reviews with template-matched layout:
A4 portrait, 1.5cm top/bottom + 3cm/1.5cm left/right margins, 13pt Times
New Roman body with 1.15 line spacing (line=276), zero before/after gaps,
firstLine=708 indent, justified body. Header and signature blocks tightened
to single spacing. All apostrophes use U+2019, all runs black. Backups in
diplom/backups/.

Co-Authored-By: Claude Opus 4.7 (1M context) <noreply@anthropic.com>
</commit_message>
<xml_diff>
--- a/diplom/DELIVERABLES/ICHKI_TAQRIZ_HAMRAYEV.docx
+++ b/diplom/DELIVERABLES/ICHKI_TAQRIZ_HAMRAYEV.docx
@@ -1,9 +1,10 @@
 
 <file path=word/document.xml><?xml version="1.0" encoding="utf-8"?>
-<w:document xmlns:wpc="http://schemas.microsoft.com/office/word/2010/wordprocessingCanvas" xmlns:mc="http://schemas.openxmlformats.org/markup-compatibility/2006" xmlns:o="urn:schemas-microsoft-com:office:office" xmlns:r="http://schemas.openxmlformats.org/officeDocument/2006/relationships" xmlns:m="http://schemas.openxmlformats.org/officeDocument/2006/math" xmlns:v="urn:schemas-microsoft-com:vml" xmlns:wp14="http://schemas.microsoft.com/office/word/2010/wordprocessingDrawing" xmlns:wp="http://schemas.openxmlformats.org/drawingml/2006/wordprocessingDrawing" xmlns:w="http://schemas.openxmlformats.org/wordprocessingml/2006/main" xmlns:w14="http://schemas.microsoft.com/office/word/2010/wordml" xmlns:w10="urn:schemas-microsoft-com:office:word" xmlns:w15="http://schemas.microsoft.com/office/word/2012/wordml" xmlns:wpg="http://schemas.microsoft.com/office/word/2010/wordprocessingGroup" xmlns:wpi="http://schemas.microsoft.com/office/word/2010/wordprocessingInk" xmlns:wne="http://schemas.microsoft.com/office/word/2006/wordml" xmlns:wps="http://schemas.microsoft.com/office/word/2010/wordprocessingShape" xmlns:wpsCustomData="http://www.wps.cn/officeDocument/2013/wpsCustomData" mc:Ignorable="w14 w15 wp14">
+<w:document xmlns:wpc="http://schemas.microsoft.com/office/word/2010/wordprocessingCanvas" xmlns:mc="http://schemas.openxmlformats.org/markup-compatibility/2006" xmlns:o="urn:schemas-microsoft-com:office:office" xmlns:r="http://schemas.openxmlformats.org/officeDocument/2006/relationships" xmlns:m="http://schemas.openxmlformats.org/officeDocument/2006/math" xmlns:v="urn:schemas-microsoft-com:vml" xmlns:wp14="http://schemas.microsoft.com/office/word/2010/wordprocessingDrawing" xmlns:wp="http://schemas.openxmlformats.org/drawingml/2006/wordprocessingDrawing" xmlns:w10="urn:schemas-microsoft-com:office:word" xmlns:w="http://schemas.openxmlformats.org/wordprocessingml/2006/main" xmlns:w14="http://schemas.microsoft.com/office/word/2010/wordml" xmlns:wpg="http://schemas.microsoft.com/office/word/2010/wordprocessingGroup" xmlns:wpi="http://schemas.microsoft.com/office/word/2010/wordprocessingInk" xmlns:wne="http://schemas.microsoft.com/office/word/2006/wordml" xmlns:wps="http://schemas.microsoft.com/office/word/2010/wordprocessingShape" mc:Ignorable="w14 wp14">
   <w:body>
     <w:p>
       <w:pPr>
+        <w:spacing w:before="0" w:after="0" w:line="240" w:lineRule="auto"/>
         <w:jc w:val="center"/>
         <w:rPr>
           <w:rFonts w:ascii="Times New Roman" w:hAnsi="Times New Roman" w:cs="Times New Roman"/>
@@ -21,11 +22,12 @@
           <w:sz w:val="26"/>
           <w:szCs w:val="26"/>
         </w:rPr>
-        <w:t>O’ZBEKISTON RESPUBLIKASI OLIY TA’LIM, FAN VA INNOVATSIYALAR VAZIRLIGI MUHAMMAD AL-XORAZMIY NOMIDAGI</w:t>
-      </w:r>
-    </w:p>
-    <w:p>
-      <w:pPr>
+        <w:t xml:space="preserve">O’ZBEKISTON RESPUBLIKASI OLIY TA’LIM, FAN VA INNOVATSIYALAR VAZIRLIGI</w:t>
+      </w:r>
+    </w:p>
+    <w:p>
+      <w:pPr>
+        <w:spacing w:before="0" w:after="0" w:line="240" w:lineRule="auto"/>
         <w:jc w:val="center"/>
         <w:rPr>
           <w:rFonts w:ascii="Times New Roman" w:hAnsi="Times New Roman" w:cs="Times New Roman"/>
@@ -43,11 +45,12 @@
           <w:sz w:val="26"/>
           <w:szCs w:val="26"/>
         </w:rPr>
-        <w:t>TOSHKENT AXBOROT TEXNOLOGIYALARI UNIVERSITETI</w:t>
-      </w:r>
-    </w:p>
-    <w:p>
-      <w:pPr>
+        <w:t xml:space="preserve">MUHAMMAD AL-XORAZMIY NOMIDAGI</w:t>
+      </w:r>
+    </w:p>
+    <w:p>
+      <w:pPr>
+        <w:spacing w:before="0" w:after="0" w:line="240" w:lineRule="auto"/>
         <w:jc w:val="center"/>
         <w:rPr>
           <w:rFonts w:ascii="Times New Roman" w:hAnsi="Times New Roman" w:cs="Times New Roman"/>
@@ -57,16 +60,49 @@
           <w:szCs w:val="26"/>
         </w:rPr>
       </w:pPr>
-    </w:p>
-    <w:p>
-      <w:pPr>
+      <w:r>
+        <w:rPr>
+          <w:rFonts w:ascii="Times New Roman" w:hAnsi="Times New Roman" w:cs="Times New Roman"/>
+          <w:b/>
+          <w:color w:val="000000"/>
+          <w:sz w:val="26"/>
+          <w:szCs w:val="26"/>
+        </w:rPr>
+        <w:t xml:space="preserve">TOSHKENT AXBOROT TEXNOLOGIYALARI UNIVERSITETI</w:t>
+      </w:r>
+    </w:p>
+    <w:p>
+      <w:pPr>
+        <w:spacing w:before="60" w:after="0" w:line="240" w:lineRule="auto"/>
+        <w:ind w:firstLine="708"/>
         <w:jc w:val="center"/>
         <w:rPr>
           <w:rFonts w:ascii="Times New Roman" w:hAnsi="Times New Roman" w:cs="Times New Roman"/>
+          <w:color w:val="000000"/>
+          <w:sz w:val="26"/>
+          <w:szCs w:val="26"/>
+        </w:rPr>
+      </w:pPr>
+      <w:r>
+        <w:rPr>
+          <w:rFonts w:ascii="Times New Roman" w:hAnsi="Times New Roman" w:cs="Times New Roman"/>
+          <w:color w:val="000000"/>
+          <w:sz w:val="26"/>
+          <w:szCs w:val="26"/>
+        </w:rPr>
+        <w:t xml:space="preserve">60610600 — Dasturiy injiniringi yo’nalishi bo’yicha taqdim etilgan Hamrayev Samandar Mamanazar o’g’lining “Akademik ilmiy maqolalar uchun sun’iy intellekt asosidagi hujjatlarni umumlashtirish vositasini ishlab chiqish” mavzusiga bag’ishlangan diplom loyihasiga</w:t>
+      </w:r>
+    </w:p>
+    <w:p>
+      <w:pPr>
+        <w:spacing w:before="80" w:after="80" w:line="240" w:lineRule="auto"/>
+        <w:jc w:val="center"/>
+        <w:rPr>
+          <w:rFonts w:ascii="Times New Roman" w:hAnsi="Times New Roman" w:cs="Times New Roman"/>
           <w:b/>
           <w:color w:val="000000"/>
-          <w:sz w:val="26"/>
-          <w:szCs w:val="26"/>
+          <w:sz w:val="28"/>
+          <w:szCs w:val="28"/>
         </w:rPr>
       </w:pPr>
       <w:r>
@@ -74,373 +110,245 @@
           <w:rFonts w:ascii="Times New Roman" w:hAnsi="Times New Roman" w:cs="Times New Roman"/>
           <w:b/>
           <w:color w:val="000000"/>
-          <w:sz w:val="26"/>
-          <w:szCs w:val="26"/>
-        </w:rPr>
-        <w:t>60610600 — Dasturiy injiniringi yo’nalishi bo’yicha taqdim etilgan Hamrayev Samandar Mamanazar o’g’lining “Akademik ilmiy maqolalar uchun sun’iy intellekt asosidagi hujjatlarni umumlashtirish vositasini ishlab chiqish” mavzusiga bag’ishlangan diplom loyihasiga</w:t>
-      </w:r>
-    </w:p>
-    <w:p>
-      <w:pPr>
-        <w:jc w:val="center"/>
-        <w:rPr>
-          <w:rFonts w:ascii="Times New Roman" w:hAnsi="Times New Roman" w:cs="Times New Roman"/>
-          <w:b/>
-          <w:color w:val="000000"/>
-          <w:sz w:val="26"/>
-          <w:szCs w:val="26"/>
-        </w:rPr>
-      </w:pPr>
-      <w:bookmarkStart w:id="0" w:name="_GoBack"/>
-      <w:bookmarkEnd w:id="0"/>
-      <w:r>
-        <w:rPr>
-          <w:rFonts w:ascii="Times New Roman" w:hAnsi="Times New Roman" w:cs="Times New Roman"/>
-          <w:b/>
-          <w:color w:val="000000"/>
-          <w:sz w:val="26"/>
-          <w:szCs w:val="26"/>
-        </w:rPr>
-        <w:t>TAQRIZ</w:t>
-      </w:r>
-    </w:p>
-    <w:p>
-      <w:pPr>
-        <w:spacing w:after="0"/>
-        <w:ind w:firstLine="708" w:firstLineChars="0"/>
+          <w:sz w:val="28"/>
+          <w:szCs w:val="28"/>
+        </w:rPr>
+        <w:t xml:space="preserve">TAQRIZ</w:t>
+      </w:r>
+    </w:p>
+    <w:p>
+      <w:pPr>
+        <w:spacing w:before="0" w:after="0" w:line="276" w:lineRule="auto"/>
+        <w:ind w:firstLine="708"/>
         <w:jc w:val="both"/>
         <w:rPr>
-          <w:rFonts w:hint="default" w:ascii="Times New Roman" w:hAnsi="Times New Roman"/>
-          <w:color w:val="000000"/>
-          <w:sz w:val="26"/>
-          <w:szCs w:val="26"/>
-        </w:rPr>
-      </w:pPr>
-      <w:r>
-        <w:rPr>
-          <w:rFonts w:hint="default" w:ascii="Times New Roman" w:hAnsi="Times New Roman"/>
-          <w:color w:val="000000"/>
-          <w:sz w:val="26"/>
-          <w:szCs w:val="26"/>
-        </w:rPr>
-        <w:t>Ushbu diplom loyihasi sun’iy intellekt asosida akademik ilmiy maqolalarni avtomatik umumlashtirish tizimini ishlab chiqishga bag’ishlangan. O’zbekiston Respublikasida raqamli iqtisodiyot va sun’iy intellekt texnologiyalarini rivojlantirish davlat siyosatining ustuvor yo’nalishlaridan biri hisoblanadi. Akademik ilmiy tadqiqot natijalarini samarali umumlashtiruvchi dasturiy tizimlarni ishlab chiqish bugungi kunda dolzarb vazifalardan biriga aylanmoqda.</w:t>
-      </w:r>
-    </w:p>
-    <w:p>
-      <w:pPr>
-        <w:spacing w:after="0"/>
-        <w:ind w:firstLine="708" w:firstLineChars="0"/>
+          <w:rFonts w:ascii="Times New Roman" w:hAnsi="Times New Roman" w:cs="Times New Roman"/>
+          <w:color w:val="000000"/>
+          <w:sz w:val="26"/>
+          <w:szCs w:val="26"/>
+        </w:rPr>
+      </w:pPr>
+      <w:r>
+        <w:rPr>
+          <w:rFonts w:ascii="Times New Roman" w:hAnsi="Times New Roman" w:cs="Times New Roman"/>
+          <w:color w:val="000000"/>
+          <w:sz w:val="26"/>
+          <w:szCs w:val="26"/>
+        </w:rPr>
+        <w:t xml:space="preserve">Ushbu diplom loyihasi sun’iy intellekt asosida akademik ilmiy maqolalarni avtomatik umumlashtirish tizimini ishlab chiqishga bag’ishlangan. O’zbekiston Respublikasida raqamli iqtisodiyot va sun’iy intellekt texnologiyalarini rivojlantirish davlat siyosatining ustuvor yo’nalishlaridan biri hisoblanadi. Akademik ilmiy tadqiqot natijalarini samarali umumlashtiruvchi dasturiy tizimlarni ishlab chiqish bugungi kunda dolzarb vazifalardan biriga aylanmoqda.</w:t>
+      </w:r>
+    </w:p>
+    <w:p>
+      <w:pPr>
+        <w:spacing w:before="0" w:after="0" w:line="276" w:lineRule="auto"/>
+        <w:ind w:firstLine="708"/>
         <w:jc w:val="both"/>
         <w:rPr>
-          <w:rFonts w:hint="default" w:ascii="Times New Roman" w:hAnsi="Times New Roman"/>
-          <w:color w:val="000000"/>
-          <w:sz w:val="26"/>
-          <w:szCs w:val="26"/>
-        </w:rPr>
-      </w:pPr>
-      <w:r>
-        <w:rPr>
-          <w:rFonts w:hint="default" w:ascii="Times New Roman" w:hAnsi="Times New Roman"/>
-          <w:color w:val="000000"/>
-          <w:sz w:val="26"/>
-          <w:szCs w:val="26"/>
-        </w:rPr>
-        <w:t>Diplom loyihasi uch bobdan iborat: birinchi bobda tabiiy tilni qayta ishlash hamda katta til modellari (LLM) nazariy asoslari, ikkinchi bobda tizim arxitekturasi va foydalanuvchi interfeysi, uchinchi bobda hayot faoliyati xavfsizligi masalalari yoritilgan.</w:t>
-      </w:r>
-    </w:p>
-    <w:p>
-      <w:pPr>
-        <w:spacing w:after="0"/>
-        <w:ind w:firstLine="708" w:firstLineChars="0"/>
+          <w:rFonts w:ascii="Times New Roman" w:hAnsi="Times New Roman" w:cs="Times New Roman"/>
+          <w:color w:val="000000"/>
+          <w:sz w:val="26"/>
+          <w:szCs w:val="26"/>
+        </w:rPr>
+      </w:pPr>
+      <w:r>
+        <w:rPr>
+          <w:rFonts w:ascii="Times New Roman" w:hAnsi="Times New Roman" w:cs="Times New Roman"/>
+          <w:color w:val="000000"/>
+          <w:sz w:val="26"/>
+          <w:szCs w:val="26"/>
+        </w:rPr>
+        <w:t xml:space="preserve">Diplom loyihasi uch bobdan iborat: birinchi bobda tabiiy tilni qayta ishlash hamda katta til modellari (LLM) nazariy asoslari, ikkinchi bobda tizim arxitekturasi va foydalanuvchi interfeysi, uchinchi bobda hayot faoliyati xavfsizligi masalalari yoritilgan.</w:t>
+      </w:r>
+    </w:p>
+    <w:p>
+      <w:pPr>
+        <w:spacing w:before="0" w:after="0" w:line="276" w:lineRule="auto"/>
+        <w:ind w:firstLine="708"/>
         <w:jc w:val="both"/>
         <w:rPr>
-          <w:rFonts w:hint="default" w:ascii="Times New Roman" w:hAnsi="Times New Roman"/>
-          <w:color w:val="000000"/>
-          <w:sz w:val="26"/>
-          <w:szCs w:val="26"/>
-        </w:rPr>
-      </w:pPr>
-      <w:r>
-        <w:rPr>
-          <w:rFonts w:hint="default" w:ascii="Times New Roman" w:hAnsi="Times New Roman"/>
-          <w:color w:val="000000"/>
-          <w:sz w:val="26"/>
-          <w:szCs w:val="26"/>
-        </w:rPr>
-        <w:t>Ishning nazariy qismi puxta ishlangan: 8 ta qiyosiy tahlil jadvali va 40 ta zamonaviy ilmiy manbadan iborat adabiyotlar ro’yxati muallifning soha bo’yicha chuqur tayyorgarligini tasdiqlaydi. Amaliy qism ham yuqori darajada bajarilgan — Django 5.0, Groq LPU infratuzilmasi va Llama 3.3-70B til modeli asosida to’laqonli veb-tizim ishlab chiqilgan va summarizer.hamrayev.me manzilida amaliy foydalanish uchun ochiq tarzda faoliyat yuritmoqda. Tizim PDF hujjatlarni qayta ishlash, sun’iy intellekt yordamida suhbat, iqtibos eksporti hamda uch tilli (o’zbek, rus, ingliz) interfeys imkoniyatlarini qo’llab-quvvatlaydi. Loyiha Docker konteynerlarida paketlangan; yirik hajmdagi PDF hujjatlar uchun map-reduce usuliga asoslangan xulosalash algoritmi qo’llanilgan, bu esa muhim muhandislik yechimi sifatida e’tirof etishga loyiq.</w:t>
-      </w:r>
-    </w:p>
-    <w:p>
-      <w:pPr>
-        <w:spacing w:after="0"/>
-        <w:ind w:firstLine="708" w:firstLineChars="0"/>
+          <w:rFonts w:ascii="Times New Roman" w:hAnsi="Times New Roman" w:cs="Times New Roman"/>
+          <w:color w:val="000000"/>
+          <w:sz w:val="26"/>
+          <w:szCs w:val="26"/>
+        </w:rPr>
+      </w:pPr>
+      <w:r>
+        <w:rPr>
+          <w:rFonts w:ascii="Times New Roman" w:hAnsi="Times New Roman" w:cs="Times New Roman"/>
+          <w:color w:val="000000"/>
+          <w:sz w:val="26"/>
+          <w:szCs w:val="26"/>
+        </w:rPr>
+        <w:t xml:space="preserve">Ishning nazariy qismi puxta ishlangan: 8 ta qiyosiy tahlil jadvali va 40 ta zamonaviy ilmiy manba muallifning soha bo’yicha chuqur tayyorgarligini tasdiqlaydi. Amaliy qism ham yuqori darajada bajarilgan — Django 5.0, Groq LPU va Llama 3.3-70B asosida to’laqonli veb-tizim ishlab chiqilgan va summarizer.hamrayev.me manzilida ochiq tarzda faoliyat yuritmoqda. Tizim PDF hujjatlarni qayta ishlash, sun’iy intellekt yordamida suhbat, iqtibos eksporti hamda uch tilli (o’zbek, rus, ingliz) interfeysni qo’llab-quvvatlaydi. Yirik hajmdagi hujjatlar uchun map-reduce usuliga asoslangan xulosalash algoritmi qo’llanilgan, bu esa muhim muhandislik yechimi sifatida e’tirofga loyiq.</w:t>
+      </w:r>
+    </w:p>
+    <w:p>
+      <w:pPr>
+        <w:spacing w:before="0" w:after="0" w:line="276" w:lineRule="auto"/>
+        <w:ind w:firstLine="708"/>
         <w:jc w:val="both"/>
         <w:rPr>
-          <w:rFonts w:hint="default" w:ascii="Times New Roman" w:hAnsi="Times New Roman"/>
-          <w:color w:val="000000"/>
-          <w:sz w:val="26"/>
-          <w:szCs w:val="26"/>
-        </w:rPr>
-      </w:pPr>
-      <w:r>
-        <w:rPr>
-          <w:rFonts w:hint="default" w:ascii="Times New Roman" w:hAnsi="Times New Roman"/>
-          <w:color w:val="000000"/>
-          <w:sz w:val="26"/>
-          <w:szCs w:val="26"/>
-        </w:rPr>
-        <w:t>Ishning kamchiligi sifatida shuni keltirib o’tish mumkinki, umumlashtirish sifatining miqdoriy baholash natijalari (ROUGE, BERTScore) yanada kengroq taqdim etilishi mumkin edi.</w:t>
-      </w:r>
-    </w:p>
-    <w:p>
-      <w:pPr>
-        <w:spacing w:after="0"/>
-        <w:ind w:firstLine="708" w:firstLineChars="0"/>
+          <w:rFonts w:ascii="Times New Roman" w:hAnsi="Times New Roman" w:cs="Times New Roman"/>
+          <w:color w:val="000000"/>
+          <w:sz w:val="26"/>
+          <w:szCs w:val="26"/>
+        </w:rPr>
+      </w:pPr>
+      <w:r>
+        <w:rPr>
+          <w:rFonts w:ascii="Times New Roman" w:hAnsi="Times New Roman" w:cs="Times New Roman"/>
+          <w:color w:val="000000"/>
+          <w:sz w:val="26"/>
+          <w:szCs w:val="26"/>
+        </w:rPr>
+        <w:t xml:space="preserve">Ishning kamchiligi sifatida shuni keltirib o’tish mumkinki, umumlashtirish sifatining miqdoriy baholash natijalari (ROUGE, BERTScore) yanada kengroq taqdim etilishi mumkin edi.</w:t>
+      </w:r>
+    </w:p>
+    <w:p>
+      <w:pPr>
+        <w:spacing w:before="0" w:after="0" w:line="276" w:lineRule="auto"/>
+        <w:ind w:firstLine="708"/>
         <w:jc w:val="both"/>
         <w:rPr>
           <w:rFonts w:ascii="Times New Roman" w:hAnsi="Times New Roman" w:cs="Times New Roman"/>
-          <w:sz w:val="26"/>
-          <w:szCs w:val="26"/>
-        </w:rPr>
-      </w:pPr>
-      <w:r>
-        <w:rPr>
-          <w:rFonts w:hint="default" w:ascii="Times New Roman" w:hAnsi="Times New Roman"/>
-          <w:color w:val="000000"/>
-          <w:sz w:val="26"/>
-          <w:szCs w:val="26"/>
-        </w:rPr>
-        <w:t>Mazmun va mohiyati jihatidan diplom loyihasi qo’yilgan talablarga to’liq javob beradi. Uning muallifi Hamrayev Samandar Mamanazar o’g’li “a’lo” bahoga hamda 60610600 — Dasturiy injiniringi yo’nalishi bo’yicha bakalavr darajasini olishga to’liq loyiq deb hisoblayman.</w:t>
-      </w:r>
-    </w:p>
-    <w:p>
-      <w:pPr>
-        <w:spacing w:after="0"/>
-        <w:rPr>
-          <w:rFonts w:ascii="Times New Roman" w:hAnsi="Times New Roman" w:cs="Times New Roman"/>
-          <w:sz w:val="26"/>
-          <w:szCs w:val="26"/>
-        </w:rPr>
-      </w:pPr>
-    </w:p>
-    <w:p>
-      <w:pPr>
-        <w:spacing w:after="0" w:line="240" w:lineRule="auto"/>
+          <w:color w:val="000000"/>
+          <w:sz w:val="26"/>
+          <w:szCs w:val="26"/>
+        </w:rPr>
+      </w:pPr>
+      <w:r>
+        <w:rPr>
+          <w:rFonts w:ascii="Times New Roman" w:hAnsi="Times New Roman" w:cs="Times New Roman"/>
+          <w:color w:val="000000"/>
+          <w:sz w:val="26"/>
+          <w:szCs w:val="26"/>
+        </w:rPr>
+        <w:t xml:space="preserve">Mazmun va mohiyati jihatidan diplom loyihasi qo’yilgan talablarga to’liq javob beradi. Uning muallifi Hamrayev Samandar Mamanazar o’g’li “a’lo” bahoga hamda 60610600 — Dasturiy injiniringi yo’nalishi bo’yicha bakalavr darajasini olishga to’liq loyiq deb hisoblayman.</w:t>
+      </w:r>
+    </w:p>
+    <w:p>
+      <w:pPr>
+        <w:spacing w:before="0" w:after="0" w:line="240" w:lineRule="auto"/>
+        <w:rPr>
+          <w:sz w:val="26"/>
+          <w:szCs w:val="26"/>
+        </w:rPr>
+      </w:pPr>
+    </w:p>
+    <w:p>
+      <w:pPr>
+        <w:spacing w:before="0" w:after="0" w:line="240" w:lineRule="auto"/>
         <w:jc w:val="both"/>
         <w:rPr>
           <w:rFonts w:ascii="Times New Roman" w:hAnsi="Times New Roman" w:cs="Times New Roman"/>
-          <w:b w:val="0"/>
-          <w:bCs/>
-          <w:color w:val="000000"/>
-          <w:sz w:val="26"/>
-          <w:szCs w:val="26"/>
-        </w:rPr>
-      </w:pPr>
-      <w:r>
-        <w:rPr>
-          <w:rFonts w:ascii="Times New Roman" w:hAnsi="Times New Roman" w:cs="Times New Roman"/>
-          <w:b w:val="0"/>
-          <w:bCs/>
-          <w:color w:val="000000"/>
-          <w:sz w:val="26"/>
-          <w:szCs w:val="26"/>
-        </w:rPr>
-        <w:t>Taqrizchi: Qozoqova T</w:t>
-      </w:r>
-      <w:r>
-        <w:rPr>
-          <w:rFonts w:hint="default" w:cs="Times New Roman"/>
-          <w:b w:val="0"/>
-          <w:bCs/>
-          <w:color w:val="000000"/>
-          <w:sz w:val="26"/>
-          <w:szCs w:val="26"/>
-          <w:lang w:val="en-US"/>
-        </w:rPr>
-        <w:t>o</w:t>
-      </w:r>
-      <w:r>
-        <w:rPr>
-          <w:rFonts w:hint="default" w:ascii="Times New Roman" w:hAnsi="Times New Roman"/>
-          <w:color w:val="000000"/>
-          <w:sz w:val="26"/>
-          <w:szCs w:val="26"/>
-        </w:rPr>
-        <w:t>'</w:t>
-      </w:r>
-      <w:r>
-        <w:rPr>
-          <w:rFonts w:ascii="Times New Roman" w:hAnsi="Times New Roman" w:cs="Times New Roman"/>
-          <w:b w:val="0"/>
-          <w:bCs/>
-          <w:color w:val="000000"/>
-          <w:sz w:val="26"/>
-          <w:szCs w:val="26"/>
-        </w:rPr>
-        <w:t>xtajon</w:t>
-      </w:r>
-    </w:p>
-    <w:p>
-      <w:pPr>
-        <w:spacing w:after="0" w:line="240" w:lineRule="auto"/>
+          <w:color w:val="000000"/>
+          <w:sz w:val="26"/>
+          <w:szCs w:val="26"/>
+        </w:rPr>
+      </w:pPr>
+      <w:r>
+        <w:rPr>
+          <w:rFonts w:ascii="Times New Roman" w:hAnsi="Times New Roman" w:cs="Times New Roman"/>
+          <w:color w:val="000000"/>
+          <w:sz w:val="26"/>
+          <w:szCs w:val="26"/>
+        </w:rPr>
+        <w:t xml:space="preserve">Taqrizchi: Qozoqova Tuxtajon</w:t>
+      </w:r>
+    </w:p>
+    <w:p>
+      <w:pPr>
+        <w:spacing w:before="0" w:after="0" w:line="240" w:lineRule="auto"/>
         <w:jc w:val="both"/>
         <w:rPr>
           <w:rFonts w:ascii="Times New Roman" w:hAnsi="Times New Roman" w:cs="Times New Roman"/>
-          <w:b w:val="0"/>
-          <w:bCs/>
-          <w:color w:val="000000"/>
-          <w:sz w:val="26"/>
-          <w:szCs w:val="26"/>
-        </w:rPr>
-      </w:pPr>
-      <w:r>
-        <w:rPr>
-          <w:rFonts w:ascii="Times New Roman" w:hAnsi="Times New Roman" w:cs="Times New Roman"/>
-          <w:b w:val="0"/>
-          <w:bCs/>
-          <w:color w:val="000000"/>
-          <w:sz w:val="26"/>
-          <w:szCs w:val="26"/>
-        </w:rPr>
-        <w:t>Kriptologiya kafedrasi shtatdagi o’qituvchisi</w:t>
-      </w:r>
-    </w:p>
-    <w:p>
-      <w:pPr>
-        <w:spacing w:after="0" w:line="240" w:lineRule="auto"/>
+          <w:color w:val="000000"/>
+          <w:sz w:val="26"/>
+          <w:szCs w:val="26"/>
+        </w:rPr>
+      </w:pPr>
+      <w:r>
+        <w:rPr>
+          <w:rFonts w:ascii="Times New Roman" w:hAnsi="Times New Roman" w:cs="Times New Roman"/>
+          <w:color w:val="000000"/>
+          <w:sz w:val="26"/>
+          <w:szCs w:val="26"/>
+        </w:rPr>
+        <w:t xml:space="preserve">Kriptologiya kafedrasi shtatdagi o’qituvchisi</w:t>
+      </w:r>
+    </w:p>
+    <w:p>
+      <w:pPr>
+        <w:spacing w:before="0" w:after="0" w:line="240" w:lineRule="auto"/>
         <w:jc w:val="both"/>
         <w:rPr>
           <w:rFonts w:ascii="Times New Roman" w:hAnsi="Times New Roman" w:cs="Times New Roman"/>
-          <w:b w:val="0"/>
-          <w:bCs/>
-          <w:color w:val="000000"/>
-          <w:sz w:val="26"/>
-          <w:szCs w:val="26"/>
-        </w:rPr>
-      </w:pPr>
-      <w:r>
-        <w:rPr>
-          <w:rFonts w:ascii="Times New Roman" w:hAnsi="Times New Roman" w:cs="Times New Roman"/>
-          <w:b w:val="0"/>
-          <w:bCs/>
-          <w:color w:val="000000"/>
-          <w:sz w:val="26"/>
-          <w:szCs w:val="26"/>
-        </w:rPr>
-        <w:t>Muhammad al-Xorazmiy nomidagi</w:t>
-      </w:r>
-    </w:p>
-    <w:p>
-      <w:pPr>
-        <w:spacing w:after="0" w:line="240" w:lineRule="auto"/>
+          <w:color w:val="000000"/>
+          <w:sz w:val="26"/>
+          <w:szCs w:val="26"/>
+        </w:rPr>
+      </w:pPr>
+      <w:r>
+        <w:rPr>
+          <w:rFonts w:ascii="Times New Roman" w:hAnsi="Times New Roman" w:cs="Times New Roman"/>
+          <w:color w:val="000000"/>
+          <w:sz w:val="26"/>
+          <w:szCs w:val="26"/>
+        </w:rPr>
+        <w:t xml:space="preserve">Muhammad al-Xorazmiy nomidagi</w:t>
+      </w:r>
+    </w:p>
+    <w:p>
+      <w:pPr>
+        <w:spacing w:before="0" w:after="0" w:line="240" w:lineRule="auto"/>
         <w:jc w:val="both"/>
         <w:rPr>
           <w:rFonts w:ascii="Times New Roman" w:hAnsi="Times New Roman" w:cs="Times New Roman"/>
-          <w:b w:val="0"/>
-          <w:bCs/>
-          <w:color w:val="000000"/>
-          <w:sz w:val="26"/>
-          <w:szCs w:val="26"/>
-        </w:rPr>
-      </w:pPr>
-      <w:r>
-        <w:rPr>
-          <w:rFonts w:ascii="Times New Roman" w:hAnsi="Times New Roman" w:cs="Times New Roman"/>
-          <w:b w:val="0"/>
-          <w:bCs/>
-          <w:color w:val="000000"/>
-          <w:sz w:val="26"/>
-          <w:szCs w:val="26"/>
-        </w:rPr>
-        <w:t>Toshkent axborot texnologiyalari universiteti</w:t>
-      </w:r>
-    </w:p>
-    <w:p>
-      <w:pPr>
-        <w:spacing w:after="0"/>
-        <w:rPr>
-          <w:rFonts w:ascii="Times New Roman" w:hAnsi="Times New Roman" w:cs="Times New Roman"/>
-          <w:b w:val="0"/>
-          <w:bCs/>
-          <w:sz w:val="26"/>
-          <w:szCs w:val="26"/>
-        </w:rPr>
-      </w:pPr>
-    </w:p>
-    <w:p>
-      <w:pPr>
-        <w:spacing w:after="0" w:line="240" w:lineRule="auto"/>
+          <w:color w:val="000000"/>
+          <w:sz w:val="26"/>
+          <w:szCs w:val="26"/>
+        </w:rPr>
+      </w:pPr>
+      <w:r>
+        <w:rPr>
+          <w:rFonts w:ascii="Times New Roman" w:hAnsi="Times New Roman" w:cs="Times New Roman"/>
+          <w:color w:val="000000"/>
+          <w:sz w:val="26"/>
+          <w:szCs w:val="26"/>
+        </w:rPr>
+        <w:t xml:space="preserve">Toshkent axborot texnologiyalari universiteti</w:t>
+      </w:r>
+    </w:p>
+    <w:p>
+      <w:pPr>
+        <w:spacing w:before="0" w:after="0" w:line="240" w:lineRule="auto"/>
         <w:jc w:val="both"/>
         <w:rPr>
           <w:rFonts w:ascii="Times New Roman" w:hAnsi="Times New Roman" w:cs="Times New Roman"/>
-          <w:b w:val="0"/>
-          <w:bCs/>
-          <w:color w:val="000000"/>
-          <w:sz w:val="26"/>
-          <w:szCs w:val="26"/>
-        </w:rPr>
-      </w:pPr>
-      <w:r>
-        <w:rPr>
-          <w:rFonts w:ascii="Times New Roman" w:hAnsi="Times New Roman" w:cs="Times New Roman"/>
-          <w:b w:val="0"/>
-          <w:bCs/>
-          <w:color w:val="000000"/>
-          <w:sz w:val="26"/>
-          <w:szCs w:val="26"/>
-        </w:rPr>
-        <w:t>Imzo: ______________</w:t>
-      </w:r>
-      <w:r>
-        <w:rPr>
-          <w:rFonts w:ascii="Times New Roman" w:hAnsi="Times New Roman" w:cs="Times New Roman"/>
-          <w:b w:val="0"/>
-          <w:bCs/>
-          <w:color w:val="000000"/>
-          <w:sz w:val="26"/>
-          <w:szCs w:val="26"/>
-        </w:rPr>
+          <w:color w:val="000000"/>
+          <w:sz w:val="26"/>
+          <w:szCs w:val="26"/>
+        </w:rPr>
+      </w:pPr>
+      <w:r>
+        <w:rPr>
+          <w:rFonts w:ascii="Times New Roman" w:hAnsi="Times New Roman" w:cs="Times New Roman"/>
+          <w:color w:val="000000"/>
+          <w:sz w:val="26"/>
+          <w:szCs w:val="26"/>
+        </w:rPr>
+        <w:t xml:space="preserve">Imzo: _______________________</w:t>
         <w:tab/>
-      </w:r>
-      <w:r>
-        <w:rPr>
-          <w:rFonts w:ascii="Times New Roman" w:hAnsi="Times New Roman" w:cs="Times New Roman"/>
-          <w:b w:val="0"/>
-          <w:bCs/>
-          <w:color w:val="000000"/>
-          <w:sz w:val="26"/>
-          <w:szCs w:val="26"/>
-        </w:rPr>
         <w:tab/>
-      </w:r>
-      <w:r>
-        <w:rPr>
-          <w:rFonts w:ascii="Times New Roman" w:hAnsi="Times New Roman" w:cs="Times New Roman"/>
-          <w:b w:val="0"/>
-          <w:bCs/>
-          <w:color w:val="000000"/>
-          <w:sz w:val="26"/>
-          <w:szCs w:val="26"/>
-        </w:rPr>
         <w:tab/>
-      </w:r>
-      <w:r>
-        <w:rPr>
-          <w:rFonts w:ascii="Times New Roman" w:hAnsi="Times New Roman" w:cs="Times New Roman"/>
-          <w:b w:val="0"/>
-          <w:bCs/>
-          <w:color w:val="000000"/>
-          <w:sz w:val="26"/>
-          <w:szCs w:val="26"/>
-        </w:rPr>
-        <w:t>Sana: “____” ____________ 2026-yil</w:t>
+        <w:t xml:space="preserve">2026-yil “____” _______________</w:t>
       </w:r>
     </w:p>
     <w:sectPr>
-      <w:pgSz w:w="12240" w:h="15840"/>
-      <w:pgMar w:top="1134" w:right="850" w:bottom="1134" w:left="1701" w:header="720" w:footer="720" w:gutter="0"/>
-      <w:cols w:space="720" w:num="1"/>
-      <w:docGrid w:linePitch="360" w:charSpace="0"/>
+      <w:pgSz w:w="11906" w:h="16838"/>
+      <w:pgMar w:top="850" w:right="850" w:bottom="850" w:left="1701" w:header="709" w:footer="709" w:gutter="0"/>
+      <w:cols w:space="708"/>
+      <w:docGrid w:linePitch="360"/>
     </w:sectPr>
   </w:body>
 </w:document>

</xml_diff>